<commit_message>
31/05/2024 20:23 refer to log entry of same date
</commit_message>
<xml_diff>
--- a/src/main/resources/PatientMedicalHistory.docx
+++ b/src/main/resources/PatientMedicalHistory.docx
@@ -5,15 +5,17 @@
     <w:tbl>
       <w:tblPr>
         <w:tblStyle w:val="TableGrid"/>
-        <w:tblW w:w="0" w:type="auto"/>
+        <w:tblW w:w="11045" w:type="dxa"/>
         <w:tblLook w:val="04A0" w:firstRow="1" w:lastRow="0" w:firstColumn="1" w:lastColumn="0" w:noHBand="0" w:noVBand="1"/>
       </w:tblPr>
       <w:tblGrid>
-        <w:gridCol w:w="1268"/>
+        <w:gridCol w:w="1260"/>
+        <w:gridCol w:w="8"/>
         <w:gridCol w:w="1361"/>
         <w:gridCol w:w="3156"/>
         <w:gridCol w:w="3945"/>
-        <w:gridCol w:w="1315"/>
+        <w:gridCol w:w="13"/>
+        <w:gridCol w:w="1302"/>
       </w:tblGrid>
       <w:tr>
         <w:trPr>
@@ -22,7 +24,7 @@
         <w:tc>
           <w:tcPr>
             <w:tcW w:w="11045" w:type="dxa"/>
-            <w:gridSpan w:val="5"/>
+            <w:gridSpan w:val="7"/>
             <w:tcBorders>
               <w:top w:val="nil"/>
               <w:left w:val="nil"/>
@@ -62,6 +64,7 @@
         <w:tc>
           <w:tcPr>
             <w:tcW w:w="1268" w:type="dxa"/>
+            <w:gridSpan w:val="2"/>
             <w:tcBorders>
               <w:top w:val="single" w:sz="4" w:space="0" w:color="auto"/>
             </w:tcBorders>
@@ -144,6 +147,7 @@
         <w:tc>
           <w:tcPr>
             <w:tcW w:w="1315" w:type="dxa"/>
+            <w:gridSpan w:val="2"/>
             <w:tcBorders>
               <w:top w:val="single" w:sz="4" w:space="0" w:color="auto"/>
             </w:tcBorders>
@@ -176,6 +180,7 @@
         <w:tc>
           <w:tcPr>
             <w:tcW w:w="1268" w:type="dxa"/>
+            <w:gridSpan w:val="2"/>
             <w:tcBorders>
               <w:top w:val="single" w:sz="4" w:space="0" w:color="auto"/>
             </w:tcBorders>
@@ -231,6 +236,7 @@
         <w:tc>
           <w:tcPr>
             <w:tcW w:w="1315" w:type="dxa"/>
+            <w:gridSpan w:val="2"/>
             <w:tcBorders>
               <w:top w:val="single" w:sz="4" w:space="0" w:color="auto"/>
             </w:tcBorders>
@@ -254,7 +260,7 @@
         <w:tc>
           <w:tcPr>
             <w:tcW w:w="2629" w:type="dxa"/>
-            <w:gridSpan w:val="2"/>
+            <w:gridSpan w:val="3"/>
             <w:shd w:val="clear" w:color="auto" w:fill="F2F2F2" w:themeFill="background1" w:themeFillShade="F2"/>
           </w:tcPr>
           <w:p>
@@ -303,7 +309,7 @@
         <w:tc>
           <w:tcPr>
             <w:tcW w:w="5260" w:type="dxa"/>
-            <w:gridSpan w:val="2"/>
+            <w:gridSpan w:val="3"/>
             <w:shd w:val="clear" w:color="auto" w:fill="F2F2F2" w:themeFill="background1" w:themeFillShade="F2"/>
           </w:tcPr>
           <w:p>
@@ -333,7 +339,7 @@
         <w:tc>
           <w:tcPr>
             <w:tcW w:w="2629" w:type="dxa"/>
-            <w:gridSpan w:val="2"/>
+            <w:gridSpan w:val="3"/>
           </w:tcPr>
           <w:p>
             <w:pPr>
@@ -362,7 +368,7 @@
         <w:tc>
           <w:tcPr>
             <w:tcW w:w="5260" w:type="dxa"/>
-            <w:gridSpan w:val="2"/>
+            <w:gridSpan w:val="3"/>
           </w:tcPr>
           <w:p>
             <w:pPr>
@@ -381,8 +387,8 @@
         </w:trPr>
         <w:tc>
           <w:tcPr>
-            <w:tcW w:w="11045" w:type="dxa"/>
-            <w:gridSpan w:val="5"/>
+            <w:tcW w:w="9743" w:type="dxa"/>
+            <w:gridSpan w:val="6"/>
             <w:shd w:val="clear" w:color="auto" w:fill="F2F2F2" w:themeFill="background1" w:themeFillShade="F2"/>
           </w:tcPr>
           <w:p>
@@ -401,6 +407,30 @@
                 <w:szCs w:val="20"/>
               </w:rPr>
               <w:t>GP Details</w:t>
+            </w:r>
+          </w:p>
+        </w:tc>
+        <w:tc>
+          <w:tcPr>
+            <w:tcW w:w="1302" w:type="dxa"/>
+            <w:shd w:val="clear" w:color="auto" w:fill="F2F2F2" w:themeFill="background1" w:themeFillShade="F2"/>
+          </w:tcPr>
+          <w:p>
+            <w:pPr>
+              <w:jc w:val="center"/>
+              <w:rPr>
+                <w:rFonts w:ascii="Arial" w:hAnsi="Arial" w:cs="Arial"/>
+                <w:sz w:val="20"/>
+                <w:szCs w:val="20"/>
+              </w:rPr>
+            </w:pPr>
+            <w:r>
+              <w:rPr>
+                <w:rFonts w:ascii="Arial" w:hAnsi="Arial" w:cs="Arial"/>
+                <w:sz w:val="20"/>
+                <w:szCs w:val="20"/>
+              </w:rPr>
+              <w:t>DOB</w:t>
             </w:r>
           </w:p>
         </w:tc>
@@ -411,8 +441,69 @@
         </w:trPr>
         <w:tc>
           <w:tcPr>
-            <w:tcW w:w="11045" w:type="dxa"/>
-            <w:gridSpan w:val="5"/>
+            <w:tcW w:w="9743" w:type="dxa"/>
+            <w:gridSpan w:val="6"/>
+            <w:shd w:val="clear" w:color="auto" w:fill="FFFFFF" w:themeFill="background1"/>
+          </w:tcPr>
+          <w:p>
+            <w:pPr>
+              <w:jc w:val="center"/>
+              <w:rPr>
+                <w:rFonts w:ascii="Arial" w:hAnsi="Arial" w:cs="Arial"/>
+                <w:sz w:val="20"/>
+                <w:szCs w:val="20"/>
+              </w:rPr>
+            </w:pPr>
+          </w:p>
+        </w:tc>
+        <w:tc>
+          <w:tcPr>
+            <w:tcW w:w="1302" w:type="dxa"/>
+            <w:shd w:val="clear" w:color="auto" w:fill="FFFFFF" w:themeFill="background1"/>
+          </w:tcPr>
+          <w:p>
+            <w:pPr>
+              <w:jc w:val="center"/>
+              <w:rPr>
+                <w:rFonts w:ascii="Arial" w:hAnsi="Arial" w:cs="Arial"/>
+                <w:sz w:val="20"/>
+                <w:szCs w:val="20"/>
+              </w:rPr>
+            </w:pPr>
+          </w:p>
+        </w:tc>
+      </w:tr>
+      <w:tr>
+        <w:trPr>
+          <w:trHeight w:val="284"/>
+        </w:trPr>
+        <w:tc>
+          <w:tcPr>
+            <w:tcW w:w="1260" w:type="dxa"/>
+            <w:shd w:val="clear" w:color="auto" w:fill="F2F2F2" w:themeFill="background1" w:themeFillShade="F2"/>
+          </w:tcPr>
+          <w:p>
+            <w:pPr>
+              <w:rPr>
+                <w:rFonts w:ascii="Arial" w:hAnsi="Arial" w:cs="Arial"/>
+                <w:sz w:val="20"/>
+                <w:szCs w:val="20"/>
+              </w:rPr>
+            </w:pPr>
+            <w:r>
+              <w:rPr>
+                <w:rFonts w:ascii="Arial" w:hAnsi="Arial" w:cs="Arial"/>
+                <w:sz w:val="20"/>
+                <w:szCs w:val="20"/>
+              </w:rPr>
+              <w:t>Medication</w:t>
+            </w:r>
+          </w:p>
+        </w:tc>
+        <w:tc>
+          <w:tcPr>
+            <w:tcW w:w="9785" w:type="dxa"/>
+            <w:gridSpan w:val="6"/>
           </w:tcPr>
           <w:p>
             <w:pPr>
@@ -549,7 +640,7 @@
                 <w:sz w:val="22"/>
                 <w:szCs w:val="22"/>
               </w:rPr>
-              <w:t>Notes / Medication</w:t>
+              <w:t>Additional Comment</w:t>
             </w:r>
           </w:p>
         </w:tc>

</xml_diff>